<commit_message>
TAPJava - GraphEditor MiNDAPI service, MindAgent getHandle, listUnits
</commit_message>
<xml_diff>
--- a/java/DustJsonApi/TAP_Review.docx
+++ b/java/DustJsonApi/TAP_Review.docx
@@ -60,14 +60,46 @@
         </w:rPr>
       </w:pPr>
       <w:r>
-        <w:t>Log is one transaction</w:t>
+        <w:t xml:space="preserve">Log is one </w:t>
+      </w:r>
+      <w:proofErr w:type="gramStart"/>
+      <w:r>
+        <w:t>transaction</w:t>
       </w:r>
       <w:r>
         <w:rPr>
           <w:lang w:val="en-US"/>
         </w:rPr>
-        <w:t>, it must remain one call with either an array or a map as a parameter.</w:t>
-      </w:r>
+        <w:t>,</w:t>
+      </w:r>
+      <w:proofErr w:type="gramEnd"/>
+      <w:r>
+        <w:rPr>
+          <w:lang w:val="en-US"/>
+        </w:rPr>
+        <w:t xml:space="preserve"> it must remain one call with either an array or a map as a parameter.</w:t>
+      </w:r>
+    </w:p>
+    <w:p>
+      <w:pPr>
+        <w:rPr>
+          <w:lang w:val="en-US"/>
+        </w:rPr>
+      </w:pPr>
+    </w:p>
+    <w:p>
+      <w:pPr>
+        <w:rPr>
+          <w:lang w:val="en-US"/>
+        </w:rPr>
+      </w:pPr>
+    </w:p>
+    <w:p>
+      <w:pPr>
+        <w:rPr>
+          <w:lang w:val="hu-HU"/>
+        </w:rPr>
+      </w:pPr>
     </w:p>
     <w:sectPr>
       <w:pgSz w:w="11906" w:h="16838"/>

</xml_diff>